<commit_message>
[docs] Update the Keycloak status after the container check
Co-Authored-By: Claude Sonnet 5.5 <noreply@anthropic.com>
</commit_message>
<xml_diff>
--- a/doc/MLW_Integration.docx
+++ b/doc/MLW_Integration.docx
@@ -1203,7 +1203,7 @@
           <w:p>
             <w:r/>
             <w:r>
-              <w:t>Docker settings</w:t>
+              <w:t>Docker settings and shared network</w:t>
             </w:r>
           </w:p>
         </w:tc>
@@ -1214,17 +1214,27 @@
           <w:p>
             <w:r/>
             <w:r>
-              <w:t xml:space="preserve">Done and pushed. </w:t>
+              <w:t xml:space="preserve">Done and pushed: </w:t>
             </w:r>
             <w:r>
               <w:rPr>
                 <w:rFonts w:ascii="Consolas" w:hAnsi="Consolas"/>
                 <w:sz w:val="20"/>
               </w:rPr>
-              <w:t>docker compose config</w:t>
+              <w:t>.env.example</w:t>
             </w:r>
             <w:r>
-              <w:t xml:space="preserve"> accepts the file.</w:t>
+              <w:t xml:space="preserve"> and </w:t>
+            </w:r>
+            <w:r>
+              <w:rPr>
+                <w:rFonts w:ascii="Consolas" w:hAnsi="Consolas"/>
+                <w:sz w:val="20"/>
+              </w:rPr>
+              <w:t>docker-compose.keycloak.yml</w:t>
+            </w:r>
+            <w:r>
+              <w:t xml:space="preserve"> join Zou to the Keycloak network.</w:t>
             </w:r>
           </w:p>
         </w:tc>
@@ -1248,7 +1258,7 @@
           <w:p>
             <w:r/>
             <w:r>
-              <w:t>Not yet checked. Needs a shared network between the containers (see the mlw-zou-docker document).</w:t>
+              <w:t>Checked: same results as above, through the published port 5010.</w:t>
             </w:r>
           </w:p>
         </w:tc>

</xml_diff>

<commit_message>
[docs] Cover KEYCLOAK_SYNC_ROLE and the admin role in the Keycloak document
Co-Authored-By: Claude Sonnet 5.5 <noreply@anthropic.com>
</commit_message>
<xml_diff>
--- a/doc/MLW_Integration.docx
+++ b/doc/MLW_Integration.docx
@@ -803,7 +803,17 @@
         <w:t>KEYCLOAK_DEFAULT_ROLE</w:t>
       </w:r>
       <w:r>
-        <w:t xml:space="preserve"> applies when nothing matches. Details and examples are in the Zou document (https://github.com/magic-lantern-workbench/zou/blob/magiclantern/doc/MLW_Integration.docx).</w:t>
+        <w:t xml:space="preserve"> applies when nothing matches. By default the role follows Keycloak at every login; </w:t>
+      </w:r>
+      <w:r>
+        <w:rPr>
+          <w:rFonts w:ascii="Consolas" w:hAnsi="Consolas"/>
+          <w:sz w:val="20"/>
+        </w:rPr>
+        <w:t>KEYCLOAK_SYNC_ROLE=first-login</w:t>
+      </w:r>
+      <w:r>
+        <w:t xml:space="preserve"> sets it only when the person is created. Details and examples are in the Zou document (https://github.com/magic-lantern-workbench/zou/blob/magiclantern/doc/MLW_Integration.docx).</w:t>
       </w:r>
     </w:p>
     <w:tbl>
@@ -969,6 +979,48 @@
               <w:t>KEYCLOAK_ROLE_MAP=mlw-kitsu-user:user</w:t>
             </w:r>
             <w:r/>
+          </w:p>
+        </w:tc>
+      </w:tr>
+      <w:tr>
+        <w:tc>
+          <w:tcPr>
+            <w:tcW w:type="dxa" w:w="4320"/>
+          </w:tcPr>
+          <w:p>
+            <w:r/>
+            <w:r>
+              <w:t xml:space="preserve">Realm role </w:t>
+            </w:r>
+            <w:r>
+              <w:rPr>
+                <w:rFonts w:ascii="Consolas" w:hAnsi="Consolas"/>
+                <w:sz w:val="20"/>
+              </w:rPr>
+              <w:t>mlw-kitsu-admin</w:t>
+            </w:r>
+            <w:r/>
+          </w:p>
+        </w:tc>
+        <w:tc>
+          <w:tcPr>
+            <w:tcW w:type="dxa" w:w="5040"/>
+          </w:tcPr>
+          <w:p>
+            <w:r/>
+            <w:r>
+              <w:t xml:space="preserve">Role admin (Studio Manager), with </w:t>
+            </w:r>
+            <w:r>
+              <w:rPr>
+                <w:rFonts w:ascii="Consolas" w:hAnsi="Consolas"/>
+                <w:sz w:val="20"/>
+              </w:rPr>
+              <w:t>mlw-kitsu-admin:admin</w:t>
+            </w:r>
+            <w:r>
+              <w:t xml:space="preserve"> in the map</w:t>
+            </w:r>
           </w:p>
         </w:tc>
       </w:tr>

</xml_diff>